<commit_message>
adicion de habilidades, stack, actualizacion cv
</commit_message>
<xml_diff>
--- a/cv/Curriculum_Vitae.docx
+++ b/cv/Curriculum_Vitae.docx
@@ -9,8 +9,8 @@
           <w:rFonts w:hint="default" w:ascii="Calibri" w:hAnsi="Calibri" w:cs="Calibri"/>
           <w:b/>
           <w:bCs/>
-          <w:sz w:val="48"/>
-          <w:szCs w:val="48"/>
+          <w:sz w:val="24"/>
+          <w:szCs w:val="24"/>
           <w:lang w:val="es-ES"/>
         </w:rPr>
       </w:pPr>
@@ -28,51 +28,70 @@
     </w:p>
     <w:p>
       <w:pPr>
-        <w:pStyle w:val="8"/>
-        <w:rPr>
-          <w:rFonts w:hint="default" w:ascii="Calibri" w:hAnsi="Calibri" w:cs="Calibri"/>
-          <w:b/>
-          <w:bCs/>
-          <w:sz w:val="24"/>
-          <w:szCs w:val="24"/>
-          <w:lang w:val="es-ES"/>
-        </w:rPr>
-      </w:pPr>
-    </w:p>
-    <w:p>
-      <w:pPr>
         <w:pStyle w:val="7"/>
         <w:spacing w:before="16"/>
         <w:rPr>
-          <w:rFonts w:hint="default" w:ascii="Calibri" w:hAnsi="Calibri" w:cs="Calibri"/>
-          <w:sz w:val="24"/>
-          <w:szCs w:val="24"/>
-        </w:rPr>
-      </w:pPr>
-      <w:r>
-        <w:rPr>
-          <w:rFonts w:hint="default" w:ascii="Calibri" w:hAnsi="Calibri" w:eastAsia="SimSun" w:cs="Calibri"/>
-          <w:sz w:val="24"/>
-          <w:szCs w:val="24"/>
-        </w:rPr>
-        <w:t>Ingeniero Informático con ~2 años de experiencia en desarrollo de aplicaciones web, con enfoque en backend. Experiencia en sistemas administrativos, validaciones de negocio y manejo de datos.</w:t>
-      </w:r>
-      <w:r>
-        <w:rPr>
-          <w:rFonts w:hint="default" w:ascii="Calibri" w:hAnsi="Calibri" w:eastAsia="SimSun" w:cs="Calibri"/>
-          <w:sz w:val="24"/>
-          <w:szCs w:val="24"/>
-        </w:rPr>
-        <w:br w:type="textWrapping"/>
-      </w:r>
-      <w:r>
-        <w:rPr>
-          <w:rFonts w:hint="default" w:ascii="Calibri" w:hAnsi="Calibri" w:eastAsia="SimSun" w:cs="Calibri"/>
-          <w:sz w:val="24"/>
-          <w:szCs w:val="24"/>
-        </w:rPr>
-        <w:t>He trabajado con tecnologías modernas y sistemas legacy, participando en integraciones de servicios y desarrollo de funcionalidades en backend y frontend. Destaco por mi capacidad de análisis, adaptación y mejora continua.</w:t>
-      </w:r>
+          <w:sz w:val="20"/>
+        </w:rPr>
+      </w:pPr>
+    </w:p>
+    <w:p>
+      <w:pPr>
+        <w:pStyle w:val="7"/>
+        <w:spacing w:before="16"/>
+        <w:rPr>
+          <w:rFonts w:hint="default" w:ascii="Calibri" w:hAnsi="Calibri" w:cs="Calibri"/>
+          <w:sz w:val="24"/>
+          <w:szCs w:val="24"/>
+        </w:rPr>
+      </w:pPr>
+      <w:r>
+        <w:rPr>
+          <w:rFonts w:hint="default" w:ascii="Calibri" w:hAnsi="Calibri" w:cs="Calibri"/>
+          <w:sz w:val="24"/>
+          <w:szCs w:val="24"/>
+        </w:rPr>
+        <w:t>Ingeniero Informático con ~2 años de experiencia en desarrollo de aplicaciones web y backend utilizando Java y Spring Boot. Experiencia en construcción y mantenimiento de sistemas administrativos, desarrollo de APIs REST, validaciones de negocio, integración de servicios, modelado y persistencia de datos.</w:t>
+      </w:r>
+    </w:p>
+    <w:p>
+      <w:pPr>
+        <w:pStyle w:val="7"/>
+        <w:spacing w:before="16"/>
+        <w:rPr>
+          <w:rFonts w:hint="default" w:ascii="Calibri" w:hAnsi="Calibri" w:cs="Calibri"/>
+          <w:sz w:val="24"/>
+          <w:szCs w:val="24"/>
+        </w:rPr>
+      </w:pPr>
+    </w:p>
+    <w:p>
+      <w:pPr>
+        <w:pStyle w:val="7"/>
+        <w:spacing w:before="16"/>
+        <w:rPr>
+          <w:rFonts w:hint="default" w:ascii="Calibri" w:hAnsi="Calibri" w:cs="Calibri"/>
+          <w:sz w:val="24"/>
+          <w:szCs w:val="24"/>
+        </w:rPr>
+      </w:pPr>
+      <w:r>
+        <w:rPr>
+          <w:rFonts w:hint="default" w:ascii="Calibri" w:hAnsi="Calibri" w:cs="Calibri"/>
+          <w:sz w:val="24"/>
+          <w:szCs w:val="24"/>
+        </w:rPr>
+        <w:t>He trabajado tanto con tecnologías modernas como con sistemas legacy, participando en desarrollo de funcionalidades backend y apoyo frontend. Cuento con experiencia utilizando Spring Data JPA, Spring Security, Hibernate, JWT y buenas prácticas de desarrollo seguro, además de conocimientos en OWASP Top 10, ISO 27001 y protección de datos aplicados al desarrollo de aplicaciones.</w:t>
+      </w:r>
+    </w:p>
+    <w:p>
+      <w:pPr>
+        <w:pStyle w:val="7"/>
+        <w:spacing w:before="16"/>
+        <w:rPr>
+          <w:sz w:val="20"/>
+        </w:rPr>
+      </w:pPr>
     </w:p>
     <w:p>
       <w:pPr>
@@ -773,6 +792,15 @@
           <w:lang w:val="es-ES"/>
         </w:rPr>
         <w:tab/>
+      </w:r>
+      <w:r>
+        <w:rPr>
+          <w:rFonts w:hint="default" w:ascii="Calibri" w:hAnsi="Calibri" w:cs="Calibri"/>
+          <w:spacing w:val="-2"/>
+          <w:sz w:val="24"/>
+          <w:szCs w:val="24"/>
+          <w:lang w:val="es-ES"/>
+        </w:rPr>
         <w:t>ube</w:t>
       </w:r>
       <w:r>
@@ -812,7 +840,6 @@
         </w:rPr>
         <w:t>API Firma Digital (</w:t>
       </w:r>
-      <w:bookmarkStart w:id="0" w:name="_GoBack"/>
       <w:r>
         <w:rPr>
           <w:rFonts w:hint="default" w:ascii="Calibri" w:hAnsi="Calibri" w:cs="Calibri"/>
@@ -824,7 +851,6 @@
         </w:rPr>
         <w:t>Gestor Documental</w:t>
       </w:r>
-      <w:bookmarkEnd w:id="0"/>
       <w:r>
         <w:rPr>
           <w:rFonts w:hint="default" w:ascii="Calibri" w:hAnsi="Calibri" w:cs="Calibri"/>
@@ -1770,7 +1796,7 @@
           <w:sz w:val="24"/>
           <w:szCs w:val="24"/>
         </w:rPr>
-        <w:t>Java (8, 17, 21) / Spring Boot / APIs REST / JSP / Servlets / SQL Server / MySQL / PostgreSQL / JavaScript / HTML / CSS / Bootstrap / jQuery / AdminLTE / Git / Bitbucket / Docker / AWS / Postman / SoapUI / SonarQube / JUnit / Swagger / Scrum / MVC / Arquitectura en capas</w:t>
+        <w:t>Java (8, 17, 21) / Spring Boot / Spring Data JPA / Spring Security / Hibernate / JWT / APIs REST / JSP / Servlets / SQL Server / MySQL / PostgreSQL / JavaScript / HTML / CSS / Bootstrap / jQuery / AdminLTE / Git / GitHub / Bitbucket / Docker / AWS / Postman / SoapUI / Swagger / OpenAPI / SonarQube / JUnit / Scrum / MVC / Arquitectura en capas / OWASP Top 10 / ISO 27001 / DLP / Desarrollo seguro</w:t>
       </w:r>
     </w:p>
     <w:p>
@@ -2191,7 +2217,7 @@
           <w:szCs w:val="26"/>
           <w:lang w:val="es-ES"/>
         </w:rPr>
-        <w:t>CERTIFICACOS</w:t>
+        <w:t>CERTIFICADOS</w:t>
       </w:r>
     </w:p>
     <w:p>
@@ -2207,7 +2233,6 @@
           <w:rFonts w:hint="default" w:ascii="Calibri" w:hAnsi="Calibri" w:eastAsia="SimSun" w:cs="Calibri"/>
           <w:sz w:val="24"/>
           <w:szCs w:val="24"/>
-          <w:lang w:val="es-ES"/>
         </w:rPr>
       </w:pPr>
       <w:r>
@@ -2216,41 +2241,8 @@
           <w:sz w:val="24"/>
           <w:szCs w:val="24"/>
         </w:rPr>
-        <w:t>Java Spring Boot / Java Spring / Scrum Professional / Historias de Usuario en Scrum / Pruebas de Software / Desarrollo de Software Seguro</w:t>
-      </w:r>
-      <w:r>
-        <w:rPr>
-          <w:rFonts w:hint="default" w:ascii="Calibri" w:hAnsi="Calibri" w:eastAsia="SimSun" w:cs="Calibri"/>
-          <w:sz w:val="24"/>
-          <w:szCs w:val="24"/>
-          <w:lang w:val="es-ES"/>
-        </w:rPr>
-        <w:t xml:space="preserve"> </w:t>
-      </w:r>
-      <w:r>
-        <w:rPr>
-          <w:rFonts w:hint="default" w:ascii="Calibri" w:hAnsi="Calibri" w:eastAsia="SimSun" w:cs="Calibri"/>
-          <w:sz w:val="24"/>
-          <w:szCs w:val="24"/>
-        </w:rPr>
-        <w:t>/ Análisis de Datos</w:t>
-      </w:r>
-    </w:p>
-    <w:p>
-      <w:pPr>
-        <w:pStyle w:val="7"/>
-        <w:numPr>
-          <w:ilvl w:val="0"/>
-          <w:numId w:val="0"/>
-        </w:numPr>
-        <w:spacing w:before="99"/>
-        <w:ind w:right="0" w:rightChars="0"/>
-        <w:rPr>
-          <w:rFonts w:hint="default" w:ascii="Calibri" w:hAnsi="Calibri" w:eastAsia="SimSun" w:cs="Calibri"/>
-          <w:sz w:val="24"/>
-          <w:szCs w:val="24"/>
-        </w:rPr>
-      </w:pPr>
+        <w:t>Java Spring Boot / Java Spring / Spring Data JPA / Spring Security / OWASP Top 10 / Fundamentos de Criptografía / ISO 27001 / DLP: Prevención de Pérdida de Datos / Desarrollo de Software Seguro / Scrum Professional / Scrum Master / Historias de Usuario en Scrum / Gestión de Equipos Ágiles / Pruebas de Software (QA) / Análisis de Datos</w:t>
+      </w:r>
     </w:p>
     <w:p>
       <w:pPr>
@@ -2470,41 +2462,17 @@
           <w:sz w:val="24"/>
           <w:szCs w:val="24"/>
         </w:rPr>
-        <w:t>Análisis de requerimientos / Resolución de problemas / Adaptación a sistemas legacy y modernos</w:t>
-      </w:r>
+        <w:t>Análisis y resolución de problemas / Desarrollo backend / Diseño de APIs REST / Modelado de bases de datos / Integración de servicios / Validaciones de negocio / Desarrollo seguro / Trabajo en equipo / Adaptabilidad / Aprendizaje continuo / Documentación técnica / Metodologías ágiles / Comunicación efectiva / Pensamiento analítico / Gestión de requerimientos / Capacidad de inves</w:t>
+      </w:r>
+      <w:bookmarkStart w:id="0" w:name="_GoBack"/>
+      <w:bookmarkEnd w:id="0"/>
       <w:r>
         <w:rPr>
           <w:rFonts w:hint="default" w:ascii="Calibri" w:hAnsi="Calibri" w:eastAsia="SimSun" w:cs="Calibri"/>
           <w:sz w:val="24"/>
           <w:szCs w:val="24"/>
-          <w:lang w:val="es-ES"/>
-        </w:rPr>
-        <w:t xml:space="preserve"> </w:t>
-      </w:r>
-      <w:r>
-        <w:rPr>
-          <w:rFonts w:hint="default" w:ascii="Calibri" w:hAnsi="Calibri" w:eastAsia="SimSun" w:cs="Calibri"/>
-          <w:sz w:val="24"/>
-          <w:szCs w:val="24"/>
-        </w:rPr>
-        <w:t>/ Trabajo en equipo</w:t>
-      </w:r>
-      <w:r>
-        <w:rPr>
-          <w:rFonts w:hint="default" w:ascii="Calibri" w:hAnsi="Calibri" w:eastAsia="SimSun" w:cs="Calibri"/>
-          <w:sz w:val="24"/>
-          <w:szCs w:val="24"/>
-          <w:lang w:val="es-ES"/>
-        </w:rPr>
-        <w:t xml:space="preserve"> </w:t>
-      </w:r>
-      <w:r>
-        <w:rPr>
-          <w:rFonts w:hint="default" w:ascii="Calibri" w:hAnsi="Calibri" w:eastAsia="SimSun" w:cs="Calibri"/>
-          <w:sz w:val="24"/>
-          <w:szCs w:val="24"/>
-        </w:rPr>
-        <w:t>/ Aprendizaje continuo</w:t>
+        </w:rPr>
+        <w:t>tigación / Mejora continua</w:t>
       </w:r>
     </w:p>
     <w:sectPr>
@@ -2670,7 +2638,7 @@
     <w:lsdException w:unhideWhenUsed="0" w:uiPriority="0" w:semiHidden="0" w:name="Document Map"/>
     <w:lsdException w:unhideWhenUsed="0" w:uiPriority="0" w:semiHidden="0" w:name="Plain Text"/>
     <w:lsdException w:unhideWhenUsed="0" w:uiPriority="0" w:semiHidden="0" w:name="E-mail Signature"/>
-    <w:lsdException w:unhideWhenUsed="0" w:uiPriority="0" w:semiHidden="0" w:name="Normal (Web)"/>
+    <w:lsdException w:qFormat="1" w:unhideWhenUsed="0" w:uiPriority="0" w:semiHidden="0" w:name="Normal (Web)"/>
     <w:lsdException w:unhideWhenUsed="0" w:uiPriority="0" w:semiHidden="0" w:name="HTML Acronym"/>
     <w:lsdException w:unhideWhenUsed="0" w:uiPriority="0" w:semiHidden="0" w:name="HTML Address"/>
     <w:lsdException w:unhideWhenUsed="0" w:uiPriority="0" w:semiHidden="0" w:name="HTML Cite"/>
@@ -2681,7 +2649,7 @@
     <w:lsdException w:unhideWhenUsed="0" w:uiPriority="0" w:semiHidden="0" w:name="HTML Sample"/>
     <w:lsdException w:unhideWhenUsed="0" w:uiPriority="0" w:semiHidden="0" w:name="HTML Typewriter"/>
     <w:lsdException w:unhideWhenUsed="0" w:uiPriority="0" w:semiHidden="0" w:name="HTML Variable"/>
-    <w:lsdException w:unhideWhenUsed="0" w:uiPriority="0" w:name="Normal Table"/>
+    <w:lsdException w:qFormat="1" w:unhideWhenUsed="0" w:uiPriority="0" w:name="Normal Table"/>
     <w:lsdException w:unhideWhenUsed="0" w:uiPriority="0" w:semiHidden="0" w:name="annotation subject"/>
     <w:lsdException w:unhideWhenUsed="0" w:uiPriority="0" w:semiHidden="0" w:name="Table Simple 1"/>
     <w:lsdException w:unhideWhenUsed="0" w:uiPriority="0" w:semiHidden="0" w:name="Table Simple 2"/>
@@ -2794,6 +2762,7 @@
   <w:style w:type="table" w:default="1" w:styleId="5">
     <w:name w:val="Normal Table"/>
     <w:semiHidden/>
+    <w:qFormat/>
     <w:uiPriority w:val="0"/>
     <w:tblPr>
       <w:tblCellMar>
@@ -2806,6 +2775,7 @@
   </w:style>
   <w:style w:type="paragraph" w:styleId="6">
     <w:name w:val="Normal (Web)"/>
+    <w:qFormat/>
     <w:uiPriority w:val="0"/>
     <w:pPr>
       <w:spacing w:before="0" w:beforeAutospacing="1" w:after="0" w:afterAutospacing="1"/>

</xml_diff>